<commit_message>
Fix dead space in fig7/composite layout (pixel-aspect-driven sizing); drop redundant in-image caption; fix abstract oscillation claim to match fig3 finding
</commit_message>
<xml_diff>
--- a/presentation/poster/COSYNE_2026_abstract_final.docx
+++ b/presentation/poster/COSYNE_2026_abstract_final.docx
@@ -90,7 +90,7 @@
           <w:sz w:val="24"/>
           <w:szCs w:val="24"/>
         </w:rPr>
-        <w:t xml:space="preserve"> mechanistic, not only descriptive: the closed loop has two stable fixed points, one per detour route, at x*=3.32 m and x*=6.70 m, with similar relaxation times (1.42 s, 1.35 s) and no oscillatory overshoot. The asymmetry is explained geometrically, by obstacle clearance, not by one route being a weaker attractor, and both fixed-point curves fall on the same PC1-PC2 manifold region as the four phase-aligned clusters. Reward-driven optimization produces a compact, phase-structured, mechanistically interpretable solution to obstacle avoidance, without biological supervision. With one training seed and a feedforward policy, the correspondence to biology is organizational, not anatomical. A planned validation dataset will compare these signatures directly with wrist kinematics and six-muscle surface electromyography in healthy adults and stroke survivors.</w:t>
+        <w:t xml:space="preserve"> mechanistic, not only descriptive: the closed loop has two stable fixed points, one per detour route, at x*=3.32 m and x*=6.70 m, with similar relaxation times (1.42 s, 1.35 s); the linearization has no oscillatory component, though the empirical correction itself briefly overshoots before settling. The asymmetry is explained geometrically, by obstacle clearance, not by one route being a weaker attractor, and both fixed-point curves fall on the same PC1-PC2 manifold region as the four phase-aligned clusters. Reward-driven optimization produces a compact, phase-structured, mechanistically interpretable solution to obstacle avoidance, without biological supervision. With one training seed and a feedforward policy, the correspondence to biology is organizational, not anatomical. A planned validation dataset will compare these signatures directly with wrist kinematics and six-muscle surface electromyography in healthy adults and stroke survivors.</w:t>
       </w:r>
     </w:p>
     <w:p>
@@ -265,7 +265,7 @@
           <w:szCs w:val="24"/>
         </w:rPr>
         <w:br/>
-        <w:t>PC1 explained 46.8% and PC2 explained 28.0% of hidden-activity variance (74.8% combined). The closed-loop fixed points are stable under linearization (real eigenvalues, magnitude below 1, for both routes), so the controller relaxes back to its detour route smoothly rather than oscillating. The two routes are close to mirror images of each other (x*=3.32 m and 6.70 m), with similar relaxation times, so the asymmetry is not explained by one route being an intrinsically weaker attractor. It is explained by clearance: the obstacle pair sits at x=4.25 m and x=5.75 m with 0.5 m radius, so the left-route fixed point leaves about 0.43 m of clearance from the near obstacle edge, and a rightward perturbation pushes the agent toward the obstacle it is already closest to.</w:t>
+        <w:t>PC1 explained 46.8% and PC2 explained 28.0% of hidden-activity variance (74.8% combined). The closed-loop fixed points are stable under linearization (real eigenvalues, magnitude below 1, for both routes), so the local dynamics do not oscillate; the empirical lateral-velocity trace nonetheless briefly overshoots the baseline before settling, reflecting the policy's finite-amplitude nonlinear correction rather than the local linear dynamics themselves. The two routes are close to mirror images of each other (x*=3.32 m and 6.70 m), with similar relaxation times, so the asymmetry is not explained by one route being an intrinsically weaker attractor. It is explained by clearance: the obstacle pair sits at x=4.25 m and x=5.75 m with 0.5 m radius, so the left-route fixed point leaves about 0.43 m of clearance from the near obstacle edge, and a rightward perturbation pushes the agent toward the obstacle it is already closest to.</w:t>
       </w:r>
       <w:r>
         <w:rPr>

</xml_diff>

<commit_message>
Fix abstract PCA numbers to match embedded figure (78.5/19.1/97.6%); compact additional-details paragraph
</commit_message>
<xml_diff>
--- a/presentation/poster/COSYNE_2026_abstract_final.docx
+++ b/presentation/poster/COSYNE_2026_abstract_final.docx
@@ -76,7 +76,7 @@
           <w:sz w:val="24"/>
           <w:szCs w:val="24"/>
         </w:rPr>
-        <w:t xml:space="preserve">. We analyzed the 256-unit hidden layer with PCA, clustering, kinematic tuning, linear decoding, and a closed-loop dynamical-systems analysis that treats the policy and the physics engine as one system. Moderate perturbations were compensated by graded path changes with almost no change in speed. Strong perturbations exposed a directional asymmetry: rightward impulses caused more failures than equal leftward impulses. The first two principal components captured 74.8% of hidden-activity variance, and four clusters aligned with movement phase across conditions. The </w:t>
+        <w:t xml:space="preserve">. We analyzed the 256-unit hidden layer with PCA, clustering, kinematic tuning, linear decoding, and a closed-loop dynamical-systems analysis that treats the policy and the physics engine as one system. Moderate perturbations were compensated by graded path changes with almost no change in speed. Strong perturbations exposed a directional asymmetry: rightward impulses caused more failures than equal leftward impulses. The first two principal components captured 97.6% of hidden-activity variance, and four clusters aligned with movement phase across conditions. The </w:t>
       </w:r>
       <w:r>
         <w:rPr>
@@ -265,7 +265,7 @@
           <w:szCs w:val="24"/>
         </w:rPr>
         <w:br/>
-        <w:t>PC1 explained 46.8% and PC2 explained 28.0% of hidden-activity variance (74.8% combined). The closed-loop fixed points are stable under linearization (real eigenvalues, magnitude below 1, for both routes), so the local dynamics do not oscillate; the empirical lateral-velocity trace nonetheless briefly overshoots the baseline before settling, reflecting the policy's finite-amplitude nonlinear correction rather than the local linear dynamics themselves. The two routes are close to mirror images of each other (x*=3.32 m and 6.70 m), with similar relaxation times, so the asymmetry is not explained by one route being an intrinsically weaker attractor. It is explained by clearance: the obstacle pair sits at x=4.25 m and x=5.75 m with 0.5 m radius, so the left-route fixed point leaves about 0.43 m of clearance from the near obstacle edge, and a rightward perturbation pushes the agent toward the obstacle it is already closest to.</w:t>
+        <w:t>PC1 explained 78.5% and PC2 explained 19.1% of hidden-activity variance (97.6% combined). The closed-loop fixed points are stable under linearization (real eigenvalues, magnitude below 1, for both routes); the local dynamics do not oscillate, though the empirical lateral-velocity trace briefly overshoots the baseline before settling, reflecting the policy's nonlinear correction rather than the local linear dynamics. The two routes are near mirror images (x*=3.32 m and 6.70 m) with similar relaxation times, so the asymmetry is not that one route is an intrinsically weaker attractor. It is clearance: the obstacles sit at x=4.25 m and x=5.75 m with 0.5 m radius, so the left-route fixed point leaves about 0.43 m of clearance from the near edge, and a rightward perturbation pushes the agent toward the obstacle it is already closest to.</w:t>
       </w:r>
       <w:r>
         <w:rPr>
@@ -280,7 +280,7 @@
           <w:szCs w:val="24"/>
         </w:rPr>
         <w:br/>
-        <w:t>The relaxation time constant we recover, 1.3 to 1.4 s, is the same quantity used to characterize feedback-controller recovery in human perturbation experiments. The present result comes from one training seed and a simplified two-dimensional controller. Multi-seed training and a planned comparison with wrist kinematics and six-muscle surface EMG in healthy adults and stroke survivors are the direct next tests of robustness and biological scope.</w:t>
+        <w:t>The 1.3-1.4 s relaxation time constant is the same quantity used to characterize feedback-controller recovery in human perturbation experiments. This result comes from one training seed and a simplified two-dimensional controller. Multi-seed training and a planned comparison with wrist kinematics and six-muscle surface EMG in healthy adults and stroke survivors are the next tests of robustness and biological scope.</w:t>
       </w:r>
     </w:p>
     <w:p>

</xml_diff>

<commit_message>
Rebuild COSYNE figure as native editable vector from single-model rollouts; update abstract and manuscript to match (push-direction failure, new fixed-point/PCA numbers)
</commit_message>
<xml_diff>
--- a/presentation/poster/COSYNE_2026_abstract_final.docx
+++ b/presentation/poster/COSYNE_2026_abstract_final.docx
@@ -6,11 +6,16 @@
       <w:pPr>
         <w:spacing w:after="40"/>
         <w:jc w:val="center"/>
+        <w:rPr>
+          <w:sz w:val="24"/>
+          <w:szCs w:val="24"/>
+        </w:rPr>
       </w:pPr>
       <w:r>
         <w:rPr>
           <w:b/>
-          <w:sz w:val="28"/>
+          <w:sz w:val="24"/>
+          <w:szCs w:val="24"/>
         </w:rPr>
         <w:t>Obstacle avoidance under perturbation: a closed-loop attractor account</w:t>
       </w:r>
@@ -48,35 +53,58 @@
           <w:sz w:val="24"/>
           <w:szCs w:val="24"/>
         </w:rPr>
-        <w:t xml:space="preserve">Obstacle avoidance requires the rapid, graded correction of an ongoing reach after an unexpected force, without derailing an otherwise successful approach to the goal. We asked whether reward training alone produces this kind of correction, and whether the resulting population dynamics resemble biological reaching. A proximal policy optimization (PPO) controller learned to move a point mass through a two-obstacle corridor to a target. Six-timestep lateral force impulses were applied at three magnitudes in each </w:t>
+        <w:t>Obstacle avoidance requires the rapid, graded correction of an ongoing reach after an unexpected force, without derailing an otherwise successful approach to the goal. We asked whether reward training alone produces this kind of correction</w:t>
       </w:r>
       <w:r>
         <w:rPr>
           <w:sz w:val="24"/>
           <w:szCs w:val="24"/>
         </w:rPr>
-        <w:t xml:space="preserve">of left and right </w:t>
+        <w:t xml:space="preserve"> </w:t>
       </w:r>
       <w:r>
         <w:rPr>
           <w:sz w:val="24"/>
           <w:szCs w:val="24"/>
         </w:rPr>
-        <w:t>direction</w:t>
+        <w:t>and whether the resulting population dynamics resemble biological reaching. A proximal policy optimization (PPO) controller learned to move a point mass through a two-obstacle corridor to a target. Lateral force impulses lasting 14 timesteps were applied at three magnitudes in each direction.</w:t>
       </w:r>
       <w:r>
         <w:rPr>
           <w:sz w:val="24"/>
           <w:szCs w:val="24"/>
         </w:rPr>
-        <w:t>s</w:t>
       </w:r>
       <w:r>
         <w:rPr>
           <w:sz w:val="24"/>
           <w:szCs w:val="24"/>
         </w:rPr>
-        <w:t xml:space="preserve">. We analyzed the 256-unit hidden layer with PCA, clustering, kinematic tuning, linear decoding, and a closed-loop dynamical-systems analysis that treats the policy and the physics engine as one system. Moderate perturbations were compensated by graded path changes with almost no change in speed. Strong perturbations exposed a directional asymmetry: rightward impulses caused more failures than equal leftward impulses. The first two principal components captured 97.6% of hidden-activity variance, and four clusters aligned with movement phase across conditions. The </w:t>
+      </w:r>
+      <w:r>
+        <w:rPr>
+          <w:sz w:val="24"/>
+          <w:szCs w:val="24"/>
+        </w:rPr>
+      </w:r>
+      <w:r>
+        <w:rPr>
+          <w:sz w:val="24"/>
+          <w:szCs w:val="24"/>
+        </w:rPr>
+      </w:r>
+      <w:r>
+        <w:rPr>
+          <w:sz w:val="24"/>
+          <w:szCs w:val="24"/>
+        </w:rPr>
+      </w:r>
+      <w:r>
+        <w:rPr>
+          <w:sz w:val="24"/>
+          <w:szCs w:val="24"/>
+        </w:rPr>
+        <w:t xml:space="preserve"> We analyzed the 256-unit hidden layer with PCA, clustering, kinematic tuning, linear decoding, and a closed-loop dynamical-systems analysis that treats the policy and the physics engine as one system. Moderate impulses were absorbed with lateral path changes under 0.1 m, at the controller's speed limit. Strong impulses failed when they pushed the agent toward the obstacles: a rightward impulse failed on the left detour and succeeded on the right, and a leftward impulse did the reverse. The first two principal components captured 70.7% of hidden-activity variance, and activity followed phase-ordered routes through that space that were shared across conditions and split by detour. The </w:t>
       </w:r>
       <w:r>
         <w:rPr>
@@ -90,7 +118,7 @@
           <w:sz w:val="24"/>
           <w:szCs w:val="24"/>
         </w:rPr>
-        <w:t xml:space="preserve"> mechanistic, not only descriptive: the closed loop has two stable fixed points, one per detour route, at x*=3.32 m and x*=6.70 m, with similar relaxation times (1.42 s, 1.35 s); the linearization has no oscillatory component, though the empirical correction itself briefly overshoots before settling. The asymmetry is explained geometrically, by obstacle clearance, not by one route being a weaker attractor, and both fixed-point curves fall on the same PC1-PC2 manifold region as the four phase-aligned clusters. Reward-driven optimization produces a compact, phase-structured, mechanistically interpretable solution to obstacle avoidance, without biological supervision. With one training seed and a feedforward policy, the correspondence to biology is organizational, not anatomical. A planned validation dataset will compare these signatures directly with wrist kinematics and six-muscle surface electromyography in healthy adults and stroke survivors.</w:t>
+        <w:t xml:space="preserve"> mechanistic, not only descriptive: the closed loop has two stable fixed points, one per detour route, at x*=3.32 m and x*=6.71 m, with similar relaxation times (1.42 s, 1.34 s) and no oscillatory component in the linearization. Failure follows push direction relative to the obstacles, not a weaker attractor on one side: the two routes leave 0.43 m and 0.46 m of clearance. Both fixed-point curves lie within the region of PC1-PC2 activity, closer to it than states at arbitrary lateral positions. Reward-driven optimization produces a compact, phase-structured, mechanistically interpretable solution to obstacle avoidance, without biological supervision. With one training seed and a feedforward policy, the correspondence to biology is organizational, not anatomical, and the fixed points depend on the checkpoint. A planned validation dataset will compare these signatures directly with wrist kinematics and six-muscle surface electromyography in healthy adults and stroke survivors.</w:t>
       </w:r>
     </w:p>
     <w:p>
@@ -156,23 +184,12 @@
         </w:rPr>
         <w:t xml:space="preserve"> </w:t>
       </w:r>
-    </w:p>
-    <w:p>
-      <w:pPr>
-        <w:spacing w:after="60"/>
-        <w:jc w:val="both"/>
-        <w:rPr>
-          <w:sz w:val="24"/>
-          <w:szCs w:val="24"/>
-        </w:rPr>
-      </w:pPr>
       <w:r>
         <w:rPr>
           <w:sz w:val="24"/>
           <w:szCs w:val="24"/>
         </w:rPr>
-        <w:br/>
-        <w:t xml:space="preserve">What is new here. We do not </w:t>
+        <w:t xml:space="preserve">We do not </w:t>
       </w:r>
       <w:r>
         <w:rPr>
@@ -193,13 +210,6 @@
           <w:sz w:val="24"/>
           <w:szCs w:val="24"/>
         </w:rPr>
-        <w:t xml:space="preserve">at </w:t>
-      </w:r>
-      <w:r>
-        <w:rPr>
-          <w:sz w:val="24"/>
-          <w:szCs w:val="24"/>
-        </w:rPr>
         <w:t>describing the population geometry</w:t>
       </w:r>
       <w:r>
@@ -214,7 +224,7 @@
           <w:sz w:val="24"/>
           <w:szCs w:val="24"/>
         </w:rPr>
-        <w:t xml:space="preserve"> treat the trained policy and the physics engine together as one closed-loop dynamical system and find its fixed points in physical state space. These fixed points match the empirical detour trajectory within a few centimetres, explain the perturbation-direction asymmetry through obstacle clearance rather than unequal attractor strength, and map onto the same region of the PC1-PC2 manifold as the four phase-aligned clusters. This gives a testable, quantitative account of how the network solves obstacle avoidance, not only that it does.</w:t>
+        <w:t xml:space="preserve"> treat the trained policy and the physics engine together as one closed-loop dynamical system and find its fixed points in physical state space. These fixed points lie within 0.11 m of where completed episodes cross the obstacle band, account for failure by push direction relative to the obstacles rather than by unequal attractor strength, and lie within the region of PC1-PC2 activity. This gives a testable, quantitative account of how the network solves obstacle avoidance, not only that it does.</w:t>
       </w:r>
     </w:p>
     <w:p>
@@ -231,9 +241,16 @@
           <w:sz w:val="24"/>
           <w:szCs w:val="24"/>
         </w:rPr>
+        <w:br/>
+        <w:t xml:space="preserve">A PPO actor-critic was trained for 3 million environment steps. The actor is a feedforward MLP with two 256-unit hidden layers, processing each timestep </w:t>
+      </w:r>
+      <w:r>
+        <w:rPr>
+          <w:sz w:val="24"/>
+          <w:szCs w:val="24"/>
+        </w:rPr>
         <w:lastRenderedPageBreak/>
-        <w:br/>
-        <w:t xml:space="preserve">A PPO actor-critic was trained for 3 million environment steps. The actor is a feedforward MLP with two 256-unit hidden layers, processing each timestep independently with no recurrence or memory. Because the policy has no memory of its own, the fixed points reported here are not fixed points of the hidden layer; there is nothing for a memoryless map to be a fixed point of. What is well posed, and what we compute instead, is the fixed points of the closed loop formed by the policy and the environment's physics. This is a direct substitute for the recurrent-network fixed-point analysis </w:t>
+        <w:t xml:space="preserve">independently with no recurrence or memory. Because the policy has no memory of its own, the fixed points reported here are not fixed points of the hidden layer; there is nothing for a memoryless map to be a fixed point of. What is well posed, and what we compute instead, is the fixed points of the closed loop formed by the policy and the environment's physics. This is a direct substitute for the recurrent-network fixed-point analysis </w:t>
       </w:r>
       <w:r>
         <w:rPr>
@@ -265,27 +282,26 @@
           <w:szCs w:val="24"/>
         </w:rPr>
         <w:br/>
-        <w:t>PC1 explained 78.5% and PC2 explained 19.1% of hidden-activity variance (97.6% combined). The closed-loop fixed points are stable under linearization (real eigenvalues, magnitude below 1, for both routes); the local dynamics do not oscillate, though the empirical lateral-velocity trace briefly overshoots the baseline before settling, reflecting the policy's nonlinear correction rather than the local linear dynamics. The two routes are near mirror images (x*=3.32 m and 6.70 m) with similar relaxation times, so the asymmetry is not that one route is an intrinsically weaker attractor. It is clearance: the obstacles sit at x=4.25 m and x=5.75 m with 0.5 m radius, so the left-route fixed point leaves about 0.43 m of clearance from the near edge, and a rightward perturbation pushes the agent toward the obstacle it is already closest to.</w:t>
+        <w:t>PC1 explained 39.8% and PC2 explained 31.0% of hidden-activity variance (70.7% combined). The closed-loop fixed points are stable under linearization (real eigenvalues, magnitude below 1, for both routes); the local dynamics do not oscillate. The two routes are near mirror images (x*=3.32 m and 6.71 m) with similar relaxation times, so failure is not explained by one route being an intrinsically weaker attractor. The obstacles sit at x=4.25 m and x=5.75 m with 0.5 m radius, which leaves 0.43 m of clearance on the left route and 0.46 m on the right. With the route fixed, an impulse toward the obstacles fails and the same impulse away from them succeeds: a rightward impulse of 1.5 failed in 0 of 30 episodes on the left route and succeeded in 30 of 30 on the right, and a leftward impulse gave the reverse.</w:t>
       </w:r>
       <w:r>
         <w:rPr>
           <w:sz w:val="24"/>
           <w:szCs w:val="24"/>
         </w:rPr>
-        <w:br/>
+        <w:t xml:space="preserve"> </w:t>
       </w:r>
       <w:r>
         <w:rPr>
           <w:sz w:val="24"/>
           <w:szCs w:val="24"/>
         </w:rPr>
-        <w:br/>
-        <w:t>The 1.3-1.4 s relaxation time constant is the same quantity used to characterize feedback-controller recovery in human perturbation experiments. This result comes from one training seed and a simplified two-dimensional controller. Multi-seed training and a planned comparison with wrist kinematics and six-muscle surface EMG in healthy adults and stroke survivors are the next tests of robustness and biological scope.</w:t>
+        <w:t>The 1.3-1.4 s relaxation time constant is the same quantity used to characterize feedback-controller recovery in human perturbation experiments. This result comes from one training seed (the best-evaluation checkpoint; the final checkpoint gives time constants of 0.64 s and 1.16 s) and a simplified two-dimensional controller. Multi-seed training and a planned comparison with wrist kinematics and six-muscle surface EMG in healthy adults and stroke survivors are the next tests of robustness and biological scope.</w:t>
       </w:r>
     </w:p>
     <w:p>
       <w:pPr>
-        <w:jc w:val="both"/>
+        <w:spacing w:after="40"/>
         <w:rPr>
           <w:sz w:val="24"/>
           <w:szCs w:val="24"/>
@@ -295,6 +311,57 @@
     <w:p>
       <w:pPr>
         <w:spacing w:after="40"/>
+        <w:rPr>
+          <w:sz w:val="20"/>
+          <w:szCs w:val="20"/>
+        </w:rPr>
+      </w:pPr>
+      <w:r>
+        <w:rPr>
+          <w:b/>
+          <w:sz w:val="20"/>
+          <w:szCs w:val="20"/>
+        </w:rPr>
+        <w:t>References</w:t>
+      </w:r>
+    </w:p>
+    <w:p>
+      <w:pPr>
+        <w:spacing w:after="40"/>
+        <w:jc w:val="both"/>
+        <w:rPr>
+          <w:sz w:val="20"/>
+          <w:szCs w:val="20"/>
+        </w:rPr>
+      </w:pPr>
+      <w:r>
+        <w:rPr>
+          <w:sz w:val="20"/>
+          <w:szCs w:val="20"/>
+        </w:rPr>
+        <w:t>Churchland MM, Cunningham JP, Kaufman MT, Foster JD, Nuyujukian P, Ryu SI, Shenoy KV. Neural population dynamics during reaching. Nature. 2012;487(7405):51-56.</w:t>
+      </w:r>
+    </w:p>
+    <w:p>
+      <w:pPr>
+        <w:spacing w:after="40"/>
+        <w:jc w:val="both"/>
+        <w:rPr>
+          <w:sz w:val="24"/>
+          <w:szCs w:val="24"/>
+        </w:rPr>
+      </w:pPr>
+      <w:r>
+        <w:rPr>
+          <w:sz w:val="20"/>
+          <w:szCs w:val="20"/>
+        </w:rPr>
+        <w:t>Sussillo D, Barak O. Opening the black box: low-dimensional dynamics in high-dimensional recurrent neural networks. Neural Comput. 2013;25(3):626-649.</w:t>
+      </w:r>
+    </w:p>
+    <w:p>
+      <w:pPr>
+        <w:pStyle w:val="NormalWeb"/>
         <w:jc w:val="center"/>
       </w:pPr>
       <w:r>
@@ -302,10 +369,10 @@
           <w:noProof/>
         </w:rPr>
         <w:drawing>
-          <wp:inline distT="0" distB="0" distL="0" distR="0" wp14:anchorId="3BEAD0E6" wp14:editId="71F06CFD">
-            <wp:extent cx="3291840" cy="2896718"/>
-            <wp:effectExtent l="0" t="0" r="0" b="0"/>
-            <wp:docPr id="1" name="Picture 1"/>
+          <wp:inline distT="0" distB="0" distL="0" distR="0" wp14:anchorId="64DCAF4C" wp14:editId="50F16528">
+            <wp:extent cx="5943600" cy="6918960"/>
+            <wp:effectExtent l="0" t="0" r="9525" b="6350"/>
+            <wp:docPr id="282155429" name="Picture 282155429"/>
             <wp:cNvGraphicFramePr>
               <a:graphicFrameLocks xmlns:a="http://schemas.openxmlformats.org/drawingml/2006/main" noChangeAspect="1"/>
             </wp:cNvGraphicFramePr>
@@ -313,23 +380,36 @@
               <a:graphicData uri="http://schemas.openxmlformats.org/drawingml/2006/picture">
                 <pic:pic xmlns:pic="http://schemas.openxmlformats.org/drawingml/2006/picture">
                   <pic:nvPicPr>
-                    <pic:cNvPr id="0" name="fig_composite_obstacle_avoidance_mechanism.png"/>
-                    <pic:cNvPicPr/>
+                    <pic:cNvPr id="0" name="Picture 1"/>
+                    <pic:cNvPicPr>
+                      <a:picLocks noChangeAspect="1" noChangeArrowheads="1"/>
+                    </pic:cNvPicPr>
                   </pic:nvPicPr>
                   <pic:blipFill>
-                    <a:blip r:embed="rId6"/>
+                    <a:blip r:embed="rId6">
+                      <a:extLst>
+                        <a:ext uri="{28A0092B-C50C-407E-A947-70E740481C1C}">
+                          <a14:useLocalDpi xmlns:a14="http://schemas.microsoft.com/office/drawing/2010/main" val="0"/>
+                        </a:ext>
+                      </a:extLst>
+                    </a:blip>
+                    <a:srcRect/>
                     <a:stretch>
                       <a:fillRect/>
                     </a:stretch>
                   </pic:blipFill>
-                  <pic:spPr>
+                  <pic:spPr bwMode="auto">
                     <a:xfrm>
                       <a:off x="0" y="0"/>
-                      <a:ext cx="3291840" cy="2896718"/>
+                      <a:ext cx="5943600" cy="6918960"/>
                     </a:xfrm>
                     <a:prstGeom prst="rect">
                       <a:avLst/>
                     </a:prstGeom>
+                    <a:noFill/>
+                    <a:ln>
+                      <a:noFill/>
+                    </a:ln>
                   </pic:spPr>
                 </pic:pic>
               </a:graphicData>
@@ -356,7 +436,7 @@
           <w:sz w:val="20"/>
           <w:szCs w:val="20"/>
         </w:rPr>
-        <w:t>Figure. Obstacle avoidance and its mechanism. (</w:t>
+        <w:t>Figure. Obstacle avoidance and its mechanism. (I) Trajectories for all seven conditions on both detour routes; crosses mark collisions, which occurred only for the strongest rightward impulse on the left route. Stars mark the fixed points at y = 5 m. (II) Hidden-layer activity in PC1-PC2, coloured by step, with the fixed-point states of both routes. (III) Commanded lateral acceleration at y = 5 m. Each route has one zero crossing with a negative slope, which is the stable fixed point. Ticks mark where completed episodes crossed y = 5 m.</w:t>
       </w:r>
       <w:r>
         <w:rPr>
@@ -365,7 +445,6 @@
           <w:sz w:val="20"/>
           <w:szCs w:val="20"/>
         </w:rPr>
-        <w:t>I</w:t>
       </w:r>
       <w:r>
         <w:rPr>
@@ -374,7 +453,6 @@
           <w:sz w:val="20"/>
           <w:szCs w:val="20"/>
         </w:rPr>
-        <w:t>) Trajectories bend with perturbation strength; dashed lines mark failures, which occur at the strongest rightward impulses. (</w:t>
       </w:r>
       <w:r>
         <w:rPr>
@@ -383,7 +461,6 @@
           <w:sz w:val="20"/>
           <w:szCs w:val="20"/>
         </w:rPr>
-        <w:t>II</w:t>
       </w:r>
       <w:r>
         <w:rPr>
@@ -392,7 +469,6 @@
           <w:sz w:val="20"/>
           <w:szCs w:val="20"/>
         </w:rPr>
-        <w:t xml:space="preserve">) </w:t>
       </w:r>
       <w:r>
         <w:rPr>
@@ -401,7 +477,6 @@
           <w:sz w:val="20"/>
           <w:szCs w:val="20"/>
         </w:rPr>
-        <w:t>Hidden layer</w:t>
       </w:r>
       <w:r>
         <w:rPr>
@@ -410,182 +485,52 @@
           <w:sz w:val="20"/>
           <w:szCs w:val="20"/>
         </w:rPr>
-        <w:t xml:space="preserve"> activity forms a compact PC1-PC2 manifold with four phase-aligned clusters. (</w:t>
       </w:r>
-      <w:r>
+    </w:p>
+    <w:p>
+      <w:pPr>
+        <w:spacing w:after="120"/>
+        <w:jc w:val="both"/>
         <w:rPr>
-          <w:i/>
-          <w:iCs/>
           <w:sz w:val="20"/>
           <w:szCs w:val="20"/>
         </w:rPr>
-        <w:t>III</w:t>
-      </w:r>
+      </w:pPr>
       <w:r>
         <w:rPr>
-          <w:i/>
-          <w:iCs/>
-          <w:sz w:val="20"/>
-          <w:szCs w:val="20"/>
-        </w:rPr>
-        <w:t xml:space="preserve">) Closed-loop analysis identifies one stable fixed point per detour route. The fixed-point curves track the empirical paths and occupy the same </w:t>
-      </w:r>
-      <w:r>
-        <w:rPr>
-          <w:i/>
-          <w:iCs/>
+          <w:b/>
+          <w:bCs/>
           <w:sz w:val="20"/>
           <w:szCs w:val="20"/>
         </w:rPr>
         <w:lastRenderedPageBreak/>
-        <w:t>manifold region as the evaluation activity. Reduced obstacle clearance on the left route is consistent with the higher failure rate under rightward perturbations.</w:t>
+        <w:t>Submission</w:t>
       </w:r>
+      <w:r>
+        <w:rPr>
+          <w:sz w:val="20"/>
+          <w:szCs w:val="20"/>
+        </w:rPr>
+        <w:t xml:space="preserve">: </w:t>
+      </w:r>
+      <w:hyperlink r:id="rId7" w:history="1">
+        <w:r>
+          <w:rPr>
+            <w:rStyle w:val="Hyperlink"/>
+            <w:sz w:val="20"/>
+            <w:szCs w:val="20"/>
+          </w:rPr>
+          <w:t>https://www.cosyne.org/abstracts-submission</w:t>
+        </w:r>
+      </w:hyperlink>
     </w:p>
     <w:p>
       <w:pPr>
-        <w:spacing w:after="40"/>
-      </w:pPr>
-      <w:r>
-        <w:rPr>
-          <w:b/>
-          <w:sz w:val="21"/>
-        </w:rPr>
-        <w:t>References</w:t>
-      </w:r>
-    </w:p>
-    <w:p>
-      <w:pPr>
-        <w:spacing w:after="40"/>
+        <w:spacing w:after="120"/>
         <w:jc w:val="both"/>
         <w:rPr>
-          <w:sz w:val="24"/>
-          <w:szCs w:val="24"/>
-        </w:rPr>
-      </w:pPr>
-      <w:r>
-        <w:rPr>
-          <w:sz w:val="24"/>
-          <w:szCs w:val="24"/>
-        </w:rPr>
-        <w:t>Churchland MM, Cunningham JP, Kaufman MT, Foster JD, Nuyujukian P, Ryu SI, Shenoy KV. Neural population dynamics during reaching. Nature. 2012;487(7405):51-56.</w:t>
-      </w:r>
-    </w:p>
-    <w:p>
-      <w:pPr>
-        <w:spacing w:after="40"/>
-        <w:jc w:val="both"/>
-        <w:rPr>
-          <w:sz w:val="24"/>
-          <w:szCs w:val="24"/>
-        </w:rPr>
-      </w:pPr>
-      <w:proofErr w:type="spellStart"/>
-      <w:r>
-        <w:rPr>
-          <w:sz w:val="24"/>
-          <w:szCs w:val="24"/>
-        </w:rPr>
-        <w:t>Sussillo</w:t>
-      </w:r>
-      <w:proofErr w:type="spellEnd"/>
-      <w:r>
-        <w:rPr>
-          <w:sz w:val="24"/>
-          <w:szCs w:val="24"/>
-        </w:rPr>
-        <w:t xml:space="preserve"> D, Barak O. Opening the black box: low-dimensional dynamics in high-dimensional recurrent neural networks. Neural Comput. 2013;25(3):626-649.</w:t>
-      </w:r>
-    </w:p>
-    <w:p>
-      <w:pPr>
-        <w:spacing w:after="40"/>
-        <w:jc w:val="both"/>
-        <w:rPr>
-          <w:sz w:val="24"/>
-          <w:szCs w:val="24"/>
-        </w:rPr>
-      </w:pPr>
-    </w:p>
-    <w:p>
-      <w:pPr>
-        <w:spacing w:after="40"/>
-        <w:jc w:val="both"/>
-        <w:rPr>
-          <w:color w:val="EE0000"/>
-          <w:sz w:val="24"/>
-          <w:szCs w:val="24"/>
-        </w:rPr>
-      </w:pPr>
-      <w:r>
-        <w:rPr>
-          <w:color w:val="EE0000"/>
-          <w:sz w:val="24"/>
-          <w:szCs w:val="24"/>
-        </w:rPr>
-        <w:t xml:space="preserve">Michaels JA, Dann B, </w:t>
-      </w:r>
-      <w:proofErr w:type="spellStart"/>
-      <w:r>
-        <w:rPr>
-          <w:color w:val="EE0000"/>
-          <w:sz w:val="24"/>
-          <w:szCs w:val="24"/>
-        </w:rPr>
-        <w:t>Scherberger</w:t>
-      </w:r>
-      <w:proofErr w:type="spellEnd"/>
-      <w:r>
-        <w:rPr>
-          <w:color w:val="EE0000"/>
-          <w:sz w:val="24"/>
-          <w:szCs w:val="24"/>
-        </w:rPr>
-        <w:t xml:space="preserve"> H. Neural population dynamics during reaching are better explained by a dynamical system than representational tuning. </w:t>
-      </w:r>
-      <w:proofErr w:type="spellStart"/>
-      <w:r>
-        <w:rPr>
-          <w:color w:val="EE0000"/>
-          <w:sz w:val="24"/>
-          <w:szCs w:val="24"/>
-        </w:rPr>
-        <w:t>PLoS</w:t>
-      </w:r>
-      <w:proofErr w:type="spellEnd"/>
-      <w:r>
-        <w:rPr>
-          <w:color w:val="EE0000"/>
-          <w:sz w:val="24"/>
-          <w:szCs w:val="24"/>
-        </w:rPr>
-        <w:t xml:space="preserve"> </w:t>
-      </w:r>
-      <w:proofErr w:type="spellStart"/>
-      <w:r>
-        <w:rPr>
-          <w:color w:val="EE0000"/>
-          <w:sz w:val="24"/>
-          <w:szCs w:val="24"/>
-        </w:rPr>
-        <w:t>Comput</w:t>
-      </w:r>
-      <w:proofErr w:type="spellEnd"/>
-      <w:r>
-        <w:rPr>
-          <w:color w:val="EE0000"/>
-          <w:sz w:val="24"/>
-          <w:szCs w:val="24"/>
-        </w:rPr>
-        <w:t xml:space="preserve"> Biol. 2016;12(11):e1005175.</w:t>
-      </w:r>
-    </w:p>
-    <w:p>
-      <w:pPr>
-        <w:spacing w:after="40"/>
-        <w:jc w:val="both"/>
-        <w:rPr>
-          <w:sz w:val="24"/>
-          <w:szCs w:val="24"/>
+          <w:sz w:val="20"/>
+          <w:szCs w:val="20"/>
         </w:rPr>
       </w:pPr>
     </w:p>
@@ -1191,7 +1136,7 @@
   <w:style w:type="paragraph" w:default="1" w:styleId="Normal">
     <w:name w:val="Normal"/>
     <w:qFormat/>
-    <w:rsid w:val="00FC693F"/>
+    <w:rsid w:val="00CB205A"/>
     <w:pPr>
       <w:spacing w:after="80" w:line="240" w:lineRule="auto"/>
     </w:pPr>
@@ -12184,6 +12129,46 @@
         <w:shd w:val="clear" w:color="auto" w:fill="FBCAA2" w:themeFill="accent6" w:themeFillTint="7F"/>
       </w:tcPr>
     </w:tblStylePr>
+  </w:style>
+  <w:style w:type="paragraph" w:styleId="NormalWeb">
+    <w:name w:val="Normal (Web)"/>
+    <w:basedOn w:val="Normal"/>
+    <w:uiPriority w:val="99"/>
+    <w:semiHidden/>
+    <w:unhideWhenUsed/>
+    <w:rsid w:val="00CB205A"/>
+    <w:pPr>
+      <w:spacing w:before="100" w:beforeAutospacing="1" w:after="100" w:afterAutospacing="1"/>
+    </w:pPr>
+    <w:rPr>
+      <w:rFonts w:ascii="Times New Roman" w:eastAsia="Times New Roman" w:hAnsi="Times New Roman" w:cs="Times New Roman"/>
+      <w:sz w:val="24"/>
+      <w:szCs w:val="24"/>
+      <w:lang w:val="en-CA" w:eastAsia="en-CA"/>
+    </w:rPr>
+  </w:style>
+  <w:style w:type="character" w:styleId="Hyperlink">
+    <w:name w:val="Hyperlink"/>
+    <w:basedOn w:val="DefaultParagraphFont"/>
+    <w:uiPriority w:val="99"/>
+    <w:unhideWhenUsed/>
+    <w:rsid w:val="00176BDF"/>
+    <w:rPr>
+      <w:color w:val="0000FF" w:themeColor="hyperlink"/>
+      <w:u w:val="single"/>
+    </w:rPr>
+  </w:style>
+  <w:style w:type="character" w:styleId="UnresolvedMention">
+    <w:name w:val="Unresolved Mention"/>
+    <w:basedOn w:val="DefaultParagraphFont"/>
+    <w:uiPriority w:val="99"/>
+    <w:semiHidden/>
+    <w:unhideWhenUsed/>
+    <w:rsid w:val="00176BDF"/>
+    <w:rPr>
+      <w:color w:val="605E5C"/>
+      <w:shd w:val="clear" w:color="auto" w:fill="E1DFDD"/>
+    </w:rPr>
   </w:style>
 </w:styles>
 </file>

</xml_diff>